<commit_message>
feat: oferta tecnica PDF ampliada amb bloc optic DWDM i switches municipals
- Nou bloc 3: capacitat optica per anell (lambdes usades/lliures, grafic)
- Bloc 2 actualitzat: switches municipals armari de carrer + factor 1.2x
- Blocs reordenats: optical(3) > decisions(4) > geomarketing(5) > findings(6)
- Regenerats outputs dels 3 escenaris

Co-Authored-By: Claude Opus 4.7 (1M context) <noreply@anthropic.com>
</commit_message>
<xml_diff>
--- a/outputs/oferta_tecnica/oferta_tecnica_TAREA5_base.docx
+++ b/outputs/oferta_tecnica/oferta_tecnica_TAREA5_base.docx
@@ -93,7 +93,7 @@
           <w:color w:val="5D6D7E"/>
           <w:sz w:val="22"/>
         </w:rPr>
-        <w:t>Fecha del documento: 2026-05-08</w:t>
+        <w:t>Fecha del documento: 2026-05-12</w:t>
       </w:r>
     </w:p>
     <w:p/>
@@ -933,7 +933,7 @@
               <w:rPr>
                 <w:sz w:val="18"/>
               </w:rPr>
-              <w:t>equipo_cliente</w:t>
+              <w:t>switch_10p</w:t>
             </w:r>
           </w:p>
         </w:tc>
@@ -951,7 +951,119 @@
               <w:rPr>
                 <w:sz w:val="18"/>
               </w:rPr>
-              <w:t>799</w:t>
+              <w:t>401</w:t>
+            </w:r>
+          </w:p>
+        </w:tc>
+      </w:tr>
+      <w:tr>
+        <w:tc>
+          <w:tcPr>
+            <w:tcW w:type="dxa" w:w="1701"/>
+            <w:vAlign w:val="center"/>
+          </w:tcPr>
+          <w:p>
+            <w:pPr>
+              <w:jc w:val="left"/>
+            </w:pPr>
+            <w:r/>
+            <w:r>
+              <w:rPr>
+                <w:sz w:val="18"/>
+              </w:rPr>
+              <w:t>Acceso</w:t>
+            </w:r>
+          </w:p>
+        </w:tc>
+        <w:tc>
+          <w:tcPr>
+            <w:tcW w:type="dxa" w:w="5102"/>
+            <w:vAlign w:val="center"/>
+          </w:tcPr>
+          <w:p>
+            <w:pPr>
+              <w:jc w:val="center"/>
+            </w:pPr>
+            <w:r/>
+            <w:r>
+              <w:rPr>
+                <w:sz w:val="18"/>
+              </w:rPr>
+              <w:t>sense_switch</w:t>
+            </w:r>
+          </w:p>
+        </w:tc>
+        <w:tc>
+          <w:tcPr>
+            <w:tcW w:type="dxa" w:w="1701"/>
+            <w:vAlign w:val="center"/>
+          </w:tcPr>
+          <w:p>
+            <w:pPr>
+              <w:jc w:val="center"/>
+            </w:pPr>
+            <w:r/>
+            <w:r>
+              <w:rPr>
+                <w:sz w:val="18"/>
+              </w:rPr>
+              <w:t>199</w:t>
+            </w:r>
+          </w:p>
+        </w:tc>
+      </w:tr>
+      <w:tr>
+        <w:tc>
+          <w:tcPr>
+            <w:tcW w:type="dxa" w:w="1701"/>
+            <w:vAlign w:val="center"/>
+          </w:tcPr>
+          <w:p>
+            <w:pPr>
+              <w:jc w:val="left"/>
+            </w:pPr>
+            <w:r/>
+            <w:r>
+              <w:rPr>
+                <w:sz w:val="18"/>
+              </w:rPr>
+              <w:t>Acceso</w:t>
+            </w:r>
+          </w:p>
+        </w:tc>
+        <w:tc>
+          <w:tcPr>
+            <w:tcW w:type="dxa" w:w="5102"/>
+            <w:vAlign w:val="center"/>
+          </w:tcPr>
+          <w:p>
+            <w:pPr>
+              <w:jc w:val="center"/>
+            </w:pPr>
+            <w:r/>
+            <w:r>
+              <w:rPr>
+                <w:sz w:val="18"/>
+              </w:rPr>
+              <w:t>switch_20p</w:t>
+            </w:r>
+          </w:p>
+        </w:tc>
+        <w:tc>
+          <w:tcPr>
+            <w:tcW w:type="dxa" w:w="1701"/>
+            <w:vAlign w:val="center"/>
+          </w:tcPr>
+          <w:p>
+            <w:pPr>
+              <w:jc w:val="center"/>
+            </w:pPr>
+            <w:r/>
+            <w:r>
+              <w:rPr>
+                <w:sz w:val="18"/>
+              </w:rPr>
+              <w:t>199</w:t>
             </w:r>
           </w:p>
         </w:tc>
@@ -1007,7 +1119,7 @@
               <w:rPr>
                 <w:sz w:val="18"/>
               </w:rPr>
-              <w:t>51</w:t>
+              <w:t>61</w:t>
             </w:r>
           </w:p>
         </w:tc>
@@ -1063,7 +1175,7 @@
               <w:rPr>
                 <w:sz w:val="18"/>
               </w:rPr>
-              <w:t>27</w:t>
+              <w:t>22</w:t>
             </w:r>
           </w:p>
         </w:tc>
@@ -1101,7 +1213,7 @@
               <w:rPr>
                 <w:sz w:val="18"/>
               </w:rPr>
-              <w:t>agreg_10p</w:t>
+              <w:t>mpls + 2×agreg_40p</w:t>
             </w:r>
           </w:p>
         </w:tc>
@@ -1119,7 +1231,7 @@
               <w:rPr>
                 <w:sz w:val="18"/>
               </w:rPr>
-              <w:t>10</w:t>
+              <w:t>5</w:t>
             </w:r>
           </w:p>
         </w:tc>
@@ -1157,7 +1269,63 @@
               <w:rPr>
                 <w:sz w:val="18"/>
               </w:rPr>
-              <w:t>mpls + 17×agreg_40p + optico_40l</w:t>
+              <w:t>mpls + 11×agreg_40p + optico_40l</w:t>
+            </w:r>
+          </w:p>
+        </w:tc>
+        <w:tc>
+          <w:tcPr>
+            <w:tcW w:type="dxa" w:w="1701"/>
+            <w:vAlign w:val="center"/>
+          </w:tcPr>
+          <w:p>
+            <w:pPr>
+              <w:jc w:val="center"/>
+            </w:pPr>
+            <w:r/>
+            <w:r>
+              <w:rPr>
+                <w:sz w:val="18"/>
+              </w:rPr>
+              <w:t>1</w:t>
+            </w:r>
+          </w:p>
+        </w:tc>
+      </w:tr>
+      <w:tr>
+        <w:tc>
+          <w:tcPr>
+            <w:tcW w:type="dxa" w:w="1701"/>
+            <w:vAlign w:val="center"/>
+          </w:tcPr>
+          <w:p>
+            <w:pPr>
+              <w:jc w:val="left"/>
+            </w:pPr>
+            <w:r/>
+            <w:r>
+              <w:rPr>
+                <w:sz w:val="18"/>
+              </w:rPr>
+              <w:t>Agregacion</w:t>
+            </w:r>
+          </w:p>
+        </w:tc>
+        <w:tc>
+          <w:tcPr>
+            <w:tcW w:type="dxa" w:w="5102"/>
+            <w:vAlign w:val="center"/>
+          </w:tcPr>
+          <w:p>
+            <w:pPr>
+              <w:jc w:val="center"/>
+            </w:pPr>
+            <w:r/>
+            <w:r>
+              <w:rPr>
+                <w:sz w:val="18"/>
+              </w:rPr>
+              <w:t>mpls + 20×agreg_40p + optico_40l</w:t>
             </w:r>
           </w:p>
         </w:tc>
@@ -1214,62 +1382,6 @@
                 <w:sz w:val="18"/>
               </w:rPr>
               <w:t>mpls + 4×agreg_40p + optico_40l</w:t>
-            </w:r>
-          </w:p>
-        </w:tc>
-        <w:tc>
-          <w:tcPr>
-            <w:tcW w:type="dxa" w:w="1701"/>
-            <w:vAlign w:val="center"/>
-          </w:tcPr>
-          <w:p>
-            <w:pPr>
-              <w:jc w:val="center"/>
-            </w:pPr>
-            <w:r/>
-            <w:r>
-              <w:rPr>
-                <w:sz w:val="18"/>
-              </w:rPr>
-              <w:t>1</w:t>
-            </w:r>
-          </w:p>
-        </w:tc>
-      </w:tr>
-      <w:tr>
-        <w:tc>
-          <w:tcPr>
-            <w:tcW w:type="dxa" w:w="1701"/>
-            <w:vAlign w:val="center"/>
-          </w:tcPr>
-          <w:p>
-            <w:pPr>
-              <w:jc w:val="left"/>
-            </w:pPr>
-            <w:r/>
-            <w:r>
-              <w:rPr>
-                <w:sz w:val="18"/>
-              </w:rPr>
-              <w:t>Agregacion</w:t>
-            </w:r>
-          </w:p>
-        </w:tc>
-        <w:tc>
-          <w:tcPr>
-            <w:tcW w:type="dxa" w:w="5102"/>
-            <w:vAlign w:val="center"/>
-          </w:tcPr>
-          <w:p>
-            <w:pPr>
-              <w:jc w:val="center"/>
-            </w:pPr>
-            <w:r/>
-            <w:r>
-              <w:rPr>
-                <w:sz w:val="18"/>
-              </w:rPr>
-              <w:t>mpls + 9×agreg_40p + optico_40l</w:t>
             </w:r>
           </w:p>
         </w:tc>
@@ -1513,7 +1625,7 @@
               <w:rPr>
                 <w:sz w:val="18"/>
               </w:rPr>
-              <w:t>7.9%</w:t>
+              <w:t>7.7%</w:t>
             </w:r>
           </w:p>
         </w:tc>
@@ -1551,7 +1663,7 @@
               <w:rPr>
                 <w:sz w:val="18"/>
               </w:rPr>
-              <w:t>1,284,000 €</w:t>
+              <w:t>1,689,000 €</w:t>
             </w:r>
           </w:p>
         </w:tc>
@@ -1569,7 +1681,7 @@
               <w:rPr>
                 <w:sz w:val="18"/>
               </w:rPr>
-              <w:t>6.8%</w:t>
+              <w:t>8.7%</w:t>
             </w:r>
           </w:p>
         </w:tc>
@@ -1625,7 +1737,7 @@
               <w:rPr>
                 <w:sz w:val="18"/>
               </w:rPr>
-              <w:t>5.8%</w:t>
+              <w:t>5.7%</w:t>
             </w:r>
           </w:p>
         </w:tc>
@@ -1681,7 +1793,7 @@
               <w:rPr>
                 <w:sz w:val="18"/>
               </w:rPr>
-              <w:t>53.2%</w:t>
+              <w:t>52.1%</w:t>
             </w:r>
           </w:p>
         </w:tc>
@@ -1737,7 +1849,7 @@
               <w:rPr>
                 <w:sz w:val="18"/>
               </w:rPr>
-              <w:t>26.3%</w:t>
+              <w:t>25.8%</w:t>
             </w:r>
           </w:p>
         </w:tc>
@@ -1775,7 +1887,7 @@
               <w:rPr>
                 <w:sz w:val="18"/>
               </w:rPr>
-              <w:t>18,984,000 €</w:t>
+              <w:t>19,389,000 €</w:t>
             </w:r>
           </w:p>
         </w:tc>

</xml_diff>